<commit_message>
Auto sync docs/source code 2026-07-08 15:46:12
</commit_message>
<xml_diff>
--- a/方向分析/专利/02_端点溯源图日志和网络流联合的APT攻击链重构方法及装置/端点溯源图日志和网络流联合的APT攻击链重构方法及装置.docx
+++ b/方向分析/专利/02_端点溯源图日志和网络流联合的APT攻击链重构方法及装置/端点溯源图日志和网络流联合的APT攻击链重构方法及装置.docx
@@ -3144,7 +3144,7 @@
         <w:pStyle w:val="a9"/>
       </w:pPr>
       <w:r>
-        <w:t xml:space="preserve">检测结果至少包括链路编号、检测等级、涉及阶段、起始时间、结束时间、关键主机、关键账号、关键进程、关键域名、关键网络流、路径风险分、证据覆盖度、关键节点、关键边和缺失环节。检测结果面向检测系统使用，可以被进一步展示、复核或用于规则生成，但本发明不依赖任何特定安全运营流程。</w:t>
+        <w:t xml:space="preserve">检测结果至少包括链路编号、检测等级、涉及阶段、起始时间、结束时间、关键主机、关键账号、关键进程、关键域名、关键网络流、路径风险分、证据覆盖度、关键节点、关键边和缺失环节。检测结果面向检测系统使用，可以作为后续模型校准、规则生成和样本标注的数据基础，但本发明不依赖任何特定平台流程。</w:t>
       </w:r>
     </w:p>
     <w:p>
@@ -5278,7 +5278,7 @@
     </w:lvl>
   </w:abstractNum>
   <w:abstractNum w:abstractNumId="990">
-    <w:nsid w:val="1dd65f3b"/>
+    <w:nsid w:val="4aee93f0"/>
     <w:multiLevelType w:val="multilevel"/>
     <w:lvl w:ilvl="0">
       <w:numFmt w:val="bullet"/>

</xml_diff>